<commit_message>
Fill admin handoff credentials
The security handoff document now includes the repository-default administrator login phone number and temporary password used by the local and E2E configuration.

Constraint: Credential values should stay isolated to the security handoff document.

Confidence: high

Scope-risk: narrow

Directive: Rotate or replace these values before production handoff if the deployed environment uses different secrets.

Tested: Verified .env.example, package scripts, and E2E setup all use 01099998888 with admin1234.

Tested: Parsed the DOCX rows and rendered the security handoff through LibreOffice.

Not-tested: Live production admin login with these credentials.
</commit_message>
<xml_diff>
--- a/docs/delivery/아가야_보안정보_전달문서.docx
+++ b/docs/delivery/아가야_보안정보_전달문서.docx
@@ -477,6 +477,13 @@
                 <w:sz w:val="20"/>
               </w:rPr>
             </w:r>
+            <w:r>
+              <w:rPr>
+                <w:rFonts w:ascii="Malgun Gothic" w:hAnsi="Malgun Gothic" w:eastAsia="Malgun Gothic"/>
+                <w:sz w:val="20"/>
+              </w:rPr>
+              <w:t>01099998888</w:t>
+            </w:r>
           </w:p>
         </w:tc>
         <w:tc>
@@ -605,6 +612,13 @@
                 <w:color w:val="1F2937"/>
                 <w:sz w:val="20"/>
               </w:rPr>
+            </w:r>
+            <w:r>
+              <w:rPr>
+                <w:rFonts w:ascii="Malgun Gothic" w:hAnsi="Malgun Gothic" w:eastAsia="Malgun Gothic"/>
+                <w:sz w:val="20"/>
+              </w:rPr>
+              <w:t>admin1234</w:t>
             </w:r>
           </w:p>
         </w:tc>
@@ -2854,7 +2868,14 @@
       </w:pPr>
     </w:p>
     <w:p>
+      <w:pPr>
+        <w:spacing w:line="288" w:lineRule="auto"/>
+      </w:pPr>
       <w:r>
+        <w:rPr>
+          <w:rFonts w:ascii="Malgun Gothic" w:hAnsi="Malgun Gothic" w:eastAsia="Malgun Gothic"/>
+          <w:sz w:val="20"/>
+        </w:rPr>
         <w:br w:type="page"/>
       </w:r>
     </w:p>

</xml_diff>